<commit_message>
Update report and presentation dates to October 2025
</commit_message>
<xml_diff>
--- a/report/Report_BigData_YoutubeAnalysis.docx
+++ b/report/Report_BigData_YoutubeAnalysis.docx
@@ -549,9 +549,8 @@
         <w:rPr>
           <w:bCs/>
           <w:szCs w:val="24"/>
-          <w:lang w:val="vi-VN"/>
-        </w:rPr>
-        <w:t>09</w:t>
+        </w:rPr>
+        <w:t>10</w:t>
       </w:r>
       <w:r>
         <w:rPr>
@@ -1131,9 +1130,8 @@
         <w:rPr>
           <w:bCs/>
           <w:szCs w:val="24"/>
-          <w:lang w:val="vi-VN"/>
-        </w:rPr>
-        <w:t>09</w:t>
+        </w:rPr>
+        <w:t>10</w:t>
       </w:r>
       <w:r>
         <w:rPr>
@@ -9669,7 +9667,7 @@
           <w:noProof/>
         </w:rPr>
         <w:drawing>
-          <wp:inline distT="0" distB="0" distL="0" distR="0" wp14:anchorId="24B094CC" wp14:editId="234A9E77">
+          <wp:inline distT="0" distB="0" distL="0" distR="0" wp14:anchorId="24B094CC" wp14:editId="4BBCAC61">
             <wp:extent cx="5399405" cy="3085465"/>
             <wp:effectExtent l="0" t="0" r="0" b="635"/>
             <wp:docPr id="968031381" name="Picture 13"/>
@@ -23055,6 +23053,7 @@
     <w:rsid w:val="002C197A"/>
     <w:rsid w:val="002E0556"/>
     <w:rsid w:val="00374D9F"/>
+    <w:rsid w:val="0039629B"/>
     <w:rsid w:val="003A4EB7"/>
     <w:rsid w:val="004271D2"/>
     <w:rsid w:val="00451499"/>
@@ -23072,6 +23071,7 @@
     <w:rsid w:val="00BA6DD7"/>
     <w:rsid w:val="00BC24B8"/>
     <w:rsid w:val="00BD4B14"/>
+    <w:rsid w:val="00BD74DE"/>
     <w:rsid w:val="00C62C87"/>
     <w:rsid w:val="00CE2AE5"/>
     <w:rsid w:val="00E70878"/>

</xml_diff>